<commit_message>
Rework части тела cover into brand style with the panda
Replace the raw square panda poster used as cover with a branded
1280x720 cover: panda illustration (cropped) on the left panel with
身体 (shēntǐ) + pinyin, cream right panel with eyebrow/title/tags/
Kitai School. Rebuild docx with the new landscape cover.

Co-Authored-By: Claude Opus 4.8 <noreply@anthropic.com>
Claude-Session: https://claude.ai/code/session_01RVXEYDcJcutEhTE5TPkTLr
</commit_message>
<xml_diff>
--- a/content/blog/chasti-tela.DZEN.docx
+++ b/content/blog/chasti-tela.DZEN.docx
@@ -53,7 +53,7 @@
       <w:r>
         <w:drawing>
           <wp:inline distT="0" distB="0" distL="0" distR="0">
-            <wp:extent cx="4476750" cy="4476750"/>
+            <wp:extent cx="5905500" cy="3324225"/>
             <wp:effectExtent t="0" r="0" b="0" l="0"/>
             <wp:docPr id="1" name="" descr="" title=""/>
             <wp:cNvGraphicFramePr>
@@ -78,7 +78,7 @@
                   <pic:spPr bwMode="auto">
                     <a:xfrm>
                       <a:off x="0" y="0"/>
-                      <a:ext cx="4476750" cy="4476750"/>
+                      <a:ext cx="5905500" cy="3324225"/>
                     </a:xfrm>
                     <a:prstGeom prst="rect">
                       <a:avLst/>

</xml_diff>